<commit_message>
Complete Report about Terraform
</commit_message>
<xml_diff>
--- a/NT548-BaiTapThucHanh-01_Nhom16.docx
+++ b/NT548-BaiTapThucHanh-01_Nhom16.docx
@@ -8287,6 +8287,8 @@
                               <w:jc w:val="center"/>
                               <w:rPr>
                                 <w:rFonts w:ascii="Times New Roman" w:hAnsi="Times New Roman" w:cs="Times New Roman"/>
+                                <w:b/>
+                                <w:bCs/>
                                 <w:color w:val="FF0000"/>
                                 <w:sz w:val="26"/>
                                 <w:szCs w:val="26"/>
@@ -8296,6 +8298,8 @@
                             <w:r>
                               <w:rPr>
                                 <w:rFonts w:ascii="Times New Roman" w:hAnsi="Times New Roman" w:cs="Times New Roman"/>
+                                <w:b/>
+                                <w:bCs/>
                                 <w:color w:val="FF0000"/>
                                 <w:sz w:val="26"/>
                                 <w:szCs w:val="26"/>
@@ -8329,6 +8333,8 @@
                         <w:jc w:val="center"/>
                         <w:rPr>
                           <w:rFonts w:ascii="Times New Roman" w:hAnsi="Times New Roman" w:cs="Times New Roman"/>
+                          <w:b/>
+                          <w:bCs/>
                           <w:color w:val="FF0000"/>
                           <w:sz w:val="26"/>
                           <w:szCs w:val="26"/>
@@ -8338,6 +8344,8 @@
                       <w:r>
                         <w:rPr>
                           <w:rFonts w:ascii="Times New Roman" w:hAnsi="Times New Roman" w:cs="Times New Roman"/>
+                          <w:b/>
+                          <w:bCs/>
                           <w:color w:val="FF0000"/>
                           <w:sz w:val="26"/>
                           <w:szCs w:val="26"/>
@@ -9890,16 +9898,7 @@
           <w:szCs w:val="26"/>
           <w:lang w:val="en-US"/>
         </w:rPr>
-        <w:t xml:space="preserve">- </w:t>
-      </w:r>
-      <w:r>
-        <w:rPr>
-          <w:rFonts w:hint="default" w:ascii="Times New Roman" w:hAnsi="Times New Roman" w:cs="Times New Roman"/>
-          <w:sz w:val="26"/>
-          <w:szCs w:val="26"/>
-          <w:lang w:val="en-US"/>
-        </w:rPr>
-        <w:t>Module VPC</w:t>
+        <w:t>- Module VPC</w:t>
       </w:r>
     </w:p>
     <w:p>
@@ -11200,7 +11199,7 @@
         </w:tabs>
         <w:spacing w:before="120" w:after="120" w:line="360" w:lineRule="auto"/>
         <w:ind w:left="708"/>
-        <w:jc w:val="both"/>
+        <w:jc w:val="center"/>
         <w:rPr>
           <w:rFonts w:hint="default" w:ascii="Times New Roman" w:hAnsi="Times New Roman" w:cs="Times New Roman"/>
           <w:sz w:val="26"/>
@@ -11209,14 +11208,11 @@
         </w:rPr>
       </w:pPr>
       <w:r>
-        <w:rPr>
-          <w:rFonts w:hint="default" w:ascii="Times New Roman" w:hAnsi="Times New Roman" w:cs="Times New Roman"/>
-        </w:rPr>
         <w:drawing>
           <wp:inline distT="0" distB="0" distL="114300" distR="114300">
-            <wp:extent cx="6383655" cy="3474720"/>
-            <wp:effectExtent l="0" t="0" r="1905" b="0"/>
-            <wp:docPr id="43" name="Picture 8"/>
+            <wp:extent cx="6509385" cy="3291840"/>
+            <wp:effectExtent l="0" t="0" r="13335" b="0"/>
+            <wp:docPr id="69" name="Picture 8"/>
             <wp:cNvGraphicFramePr>
               <a:graphicFrameLocks xmlns:a="http://schemas.openxmlformats.org/drawingml/2006/main" noChangeAspect="1"/>
             </wp:cNvGraphicFramePr>
@@ -11224,7 +11220,7 @@
               <a:graphicData uri="http://schemas.openxmlformats.org/drawingml/2006/picture">
                 <pic:pic xmlns:pic="http://schemas.openxmlformats.org/drawingml/2006/picture">
                   <pic:nvPicPr>
-                    <pic:cNvPr id="43" name="Picture 8"/>
+                    <pic:cNvPr id="69" name="Picture 8"/>
                     <pic:cNvPicPr>
                       <a:picLocks noChangeAspect="1"/>
                     </pic:cNvPicPr>
@@ -11238,7 +11234,7 @@
                   <pic:spPr>
                     <a:xfrm>
                       <a:off x="0" y="0"/>
-                      <a:ext cx="6383655" cy="3474720"/>
+                      <a:ext cx="6509385" cy="3291840"/>
                     </a:xfrm>
                     <a:prstGeom prst="rect">
                       <a:avLst/>
@@ -11377,6 +11373,7 @@
     <w:p>
       <w:pPr>
         <w:numPr>
+          <w:ilvl w:val="0"/>
           <w:numId w:val="0"/>
         </w:numPr>
         <w:tabs>
@@ -11404,6 +11401,7 @@
     <w:p>
       <w:pPr>
         <w:numPr>
+          <w:ilvl w:val="0"/>
           <w:numId w:val="0"/>
         </w:numPr>
         <w:tabs>
@@ -11431,6 +11429,7 @@
     <w:p>
       <w:pPr>
         <w:numPr>
+          <w:ilvl w:val="0"/>
           <w:numId w:val="0"/>
         </w:numPr>
         <w:tabs>
@@ -11492,6 +11491,7 @@
     <w:p>
       <w:pPr>
         <w:numPr>
+          <w:ilvl w:val="0"/>
           <w:numId w:val="0"/>
         </w:numPr>
         <w:tabs>
@@ -11519,6 +11519,7 @@
     <w:p>
       <w:pPr>
         <w:numPr>
+          <w:ilvl w:val="0"/>
           <w:numId w:val="0"/>
         </w:numPr>
         <w:tabs>
@@ -11574,6 +11575,7 @@
     <w:p>
       <w:pPr>
         <w:numPr>
+          <w:ilvl w:val="0"/>
           <w:numId w:val="0"/>
         </w:numPr>
         <w:tabs>
@@ -11629,6 +11631,7 @@
     <w:p>
       <w:pPr>
         <w:numPr>
+          <w:ilvl w:val="0"/>
           <w:numId w:val="0"/>
         </w:numPr>
         <w:tabs>
@@ -11688,6 +11691,7 @@
     <w:p>
       <w:pPr>
         <w:numPr>
+          <w:ilvl w:val="0"/>
           <w:numId w:val="0"/>
         </w:numPr>
         <w:tabs>
@@ -11715,6 +11719,7 @@
     <w:p>
       <w:pPr>
         <w:numPr>
+          <w:ilvl w:val="0"/>
           <w:numId w:val="0"/>
         </w:numPr>
         <w:tabs>
@@ -11742,6 +11747,7 @@
     <w:p>
       <w:pPr>
         <w:numPr>
+          <w:ilvl w:val="0"/>
           <w:numId w:val="0"/>
         </w:numPr>
         <w:tabs>
@@ -11797,6 +11803,7 @@
     <w:p>
       <w:pPr>
         <w:numPr>
+          <w:ilvl w:val="0"/>
           <w:numId w:val="0"/>
         </w:numPr>
         <w:tabs>
@@ -11852,6 +11859,7 @@
     <w:p>
       <w:pPr>
         <w:numPr>
+          <w:ilvl w:val="0"/>
           <w:numId w:val="0"/>
         </w:numPr>
         <w:tabs>
@@ -11911,6 +11919,7 @@
     <w:p>
       <w:pPr>
         <w:numPr>
+          <w:ilvl w:val="0"/>
           <w:numId w:val="0"/>
         </w:numPr>
         <w:tabs>
@@ -11938,6 +11947,7 @@
     <w:p>
       <w:pPr>
         <w:numPr>
+          <w:ilvl w:val="0"/>
           <w:numId w:val="0"/>
         </w:numPr>
         <w:tabs>
@@ -11993,6 +12003,7 @@
     <w:p>
       <w:pPr>
         <w:numPr>
+          <w:ilvl w:val="0"/>
           <w:numId w:val="0"/>
         </w:numPr>
         <w:tabs>
@@ -12048,6 +12059,7 @@
     <w:p>
       <w:pPr>
         <w:numPr>
+          <w:ilvl w:val="0"/>
           <w:numId w:val="0"/>
         </w:numPr>
         <w:tabs>
@@ -12107,6 +12119,7 @@
     <w:p>
       <w:pPr>
         <w:numPr>
+          <w:ilvl w:val="0"/>
           <w:numId w:val="0"/>
         </w:numPr>
         <w:tabs>
@@ -12134,6 +12147,7 @@
     <w:p>
       <w:pPr>
         <w:numPr>
+          <w:ilvl w:val="0"/>
           <w:numId w:val="0"/>
         </w:numPr>
         <w:tabs>
@@ -12161,6 +12175,7 @@
     <w:p>
       <w:pPr>
         <w:numPr>
+          <w:ilvl w:val="0"/>
           <w:numId w:val="0"/>
         </w:numPr>
         <w:tabs>
@@ -12222,6 +12237,7 @@
     <w:p>
       <w:pPr>
         <w:numPr>
+          <w:ilvl w:val="0"/>
           <w:numId w:val="0"/>
         </w:numPr>
         <w:tabs>
@@ -12249,6 +12265,7 @@
     <w:p>
       <w:pPr>
         <w:numPr>
+          <w:ilvl w:val="0"/>
           <w:numId w:val="0"/>
         </w:numPr>
         <w:tabs>
@@ -12310,6 +12327,7 @@
     <w:p>
       <w:pPr>
         <w:numPr>
+          <w:ilvl w:val="0"/>
           <w:numId w:val="0"/>
         </w:numPr>
         <w:tabs>
@@ -12337,6 +12355,7 @@
     <w:p>
       <w:pPr>
         <w:numPr>
+          <w:ilvl w:val="0"/>
           <w:numId w:val="0"/>
         </w:numPr>
         <w:tabs>
@@ -12392,6 +12411,7 @@
     <w:p>
       <w:pPr>
         <w:numPr>
+          <w:ilvl w:val="0"/>
           <w:numId w:val="0"/>
         </w:numPr>
         <w:tabs>
@@ -12451,6 +12471,7 @@
     <w:p>
       <w:pPr>
         <w:numPr>
+          <w:ilvl w:val="0"/>
           <w:numId w:val="0"/>
         </w:numPr>
         <w:tabs>
@@ -12458,6 +12479,7 @@
         </w:tabs>
         <w:spacing w:before="120" w:after="120" w:line="360" w:lineRule="auto"/>
         <w:ind w:left="708" w:leftChars="0"/>
+        <w:jc w:val="both"/>
         <w:rPr>
           <w:rFonts w:hint="default" w:ascii="Times New Roman" w:hAnsi="Times New Roman" w:cs="Times New Roman"/>
           <w:sz w:val="26"/>
@@ -12472,12 +12494,13 @@
           <w:szCs w:val="26"/>
           <w:lang w:val="en-US"/>
         </w:rPr>
-        <w:t>Thử kết nối đến EC2 public, sau đó ping đến google.com. Nơi chạy terminal phải có file key_pair mưới ssh được</w:t>
+        <w:t>Thử kết nối đến EC2 public, sau đó ping đến google.com. Nơi chạy terminal phải có file key_pair mới ssh được</w:t>
       </w:r>
     </w:p>
     <w:p>
       <w:pPr>
         <w:numPr>
+          <w:ilvl w:val="0"/>
           <w:numId w:val="0"/>
         </w:numPr>
         <w:tabs>
@@ -12485,13 +12508,14 @@
         </w:tabs>
         <w:spacing w:before="120" w:after="120" w:line="360" w:lineRule="auto"/>
         <w:ind w:left="708" w:leftChars="0"/>
+        <w:jc w:val="center"/>
       </w:pPr>
       <w:r>
         <w:drawing>
           <wp:inline distT="0" distB="0" distL="114300" distR="114300">
-            <wp:extent cx="6402070" cy="2743200"/>
-            <wp:effectExtent l="0" t="0" r="13970" b="0"/>
-            <wp:docPr id="59" name="Picture 24"/>
+            <wp:extent cx="6499225" cy="3017520"/>
+            <wp:effectExtent l="0" t="0" r="8255" b="0"/>
+            <wp:docPr id="66" name="Picture 5"/>
             <wp:cNvGraphicFramePr>
               <a:graphicFrameLocks xmlns:a="http://schemas.openxmlformats.org/drawingml/2006/main" noChangeAspect="1"/>
             </wp:cNvGraphicFramePr>
@@ -12499,7 +12523,7 @@
               <a:graphicData uri="http://schemas.openxmlformats.org/drawingml/2006/picture">
                 <pic:pic xmlns:pic="http://schemas.openxmlformats.org/drawingml/2006/picture">
                   <pic:nvPicPr>
-                    <pic:cNvPr id="59" name="Picture 24"/>
+                    <pic:cNvPr id="66" name="Picture 5"/>
                     <pic:cNvPicPr>
                       <a:picLocks noChangeAspect="1"/>
                     </pic:cNvPicPr>
@@ -12513,7 +12537,7 @@
                   <pic:spPr>
                     <a:xfrm>
                       <a:off x="0" y="0"/>
-                      <a:ext cx="6402070" cy="2743200"/>
+                      <a:ext cx="6499225" cy="3017520"/>
                     </a:xfrm>
                     <a:prstGeom prst="rect">
                       <a:avLst/>
@@ -12533,6 +12557,7 @@
     <w:p>
       <w:pPr>
         <w:numPr>
+          <w:ilvl w:val="0"/>
           <w:numId w:val="0"/>
         </w:numPr>
         <w:tabs>
@@ -12540,6 +12565,7 @@
         </w:tabs>
         <w:spacing w:before="120" w:after="120" w:line="360" w:lineRule="auto"/>
         <w:ind w:left="708" w:leftChars="0"/>
+        <w:jc w:val="center"/>
         <w:rPr>
           <w:rFonts w:hint="default"/>
           <w:lang w:val="en-US"/>
@@ -12548,9 +12574,9 @@
       <w:r>
         <w:drawing>
           <wp:inline distT="0" distB="0" distL="114300" distR="114300">
-            <wp:extent cx="6492240" cy="2834640"/>
-            <wp:effectExtent l="0" t="0" r="0" b="0"/>
-            <wp:docPr id="60" name="Picture 25"/>
+            <wp:extent cx="6094095" cy="1828800"/>
+            <wp:effectExtent l="0" t="0" r="1905" b="0"/>
+            <wp:docPr id="65" name="Picture 4"/>
             <wp:cNvGraphicFramePr>
               <a:graphicFrameLocks xmlns:a="http://schemas.openxmlformats.org/drawingml/2006/main" noChangeAspect="1"/>
             </wp:cNvGraphicFramePr>
@@ -12558,7 +12584,7 @@
               <a:graphicData uri="http://schemas.openxmlformats.org/drawingml/2006/picture">
                 <pic:pic xmlns:pic="http://schemas.openxmlformats.org/drawingml/2006/picture">
                   <pic:nvPicPr>
-                    <pic:cNvPr id="60" name="Picture 25"/>
+                    <pic:cNvPr id="65" name="Picture 4"/>
                     <pic:cNvPicPr>
                       <a:picLocks noChangeAspect="1"/>
                     </pic:cNvPicPr>
@@ -12572,7 +12598,7 @@
                   <pic:spPr>
                     <a:xfrm>
                       <a:off x="0" y="0"/>
-                      <a:ext cx="6492240" cy="2834640"/>
+                      <a:ext cx="6094095" cy="1828800"/>
                     </a:xfrm>
                     <a:prstGeom prst="rect">
                       <a:avLst/>
@@ -12592,6 +12618,7 @@
     <w:p>
       <w:pPr>
         <w:numPr>
+          <w:ilvl w:val="0"/>
           <w:numId w:val="0"/>
         </w:numPr>
         <w:tabs>
@@ -12619,6 +12646,7 @@
     <w:p>
       <w:pPr>
         <w:numPr>
+          <w:ilvl w:val="0"/>
           <w:numId w:val="0"/>
         </w:numPr>
         <w:tabs>
@@ -12626,13 +12654,17 @@
         </w:tabs>
         <w:spacing w:before="120" w:after="120" w:line="360" w:lineRule="auto"/>
         <w:ind w:left="708" w:leftChars="0"/>
+        <w:rPr>
+          <w:rFonts w:hint="default"/>
+          <w:lang w:val="en-US"/>
+        </w:rPr>
       </w:pPr>
       <w:r>
         <w:drawing>
           <wp:inline distT="0" distB="0" distL="114300" distR="114300">
-            <wp:extent cx="6372860" cy="2194560"/>
-            <wp:effectExtent l="0" t="0" r="12700" b="0"/>
-            <wp:docPr id="61" name="Picture 26"/>
+            <wp:extent cx="6348095" cy="2560320"/>
+            <wp:effectExtent l="0" t="0" r="6985" b="0"/>
+            <wp:docPr id="64" name="Picture 3"/>
             <wp:cNvGraphicFramePr>
               <a:graphicFrameLocks xmlns:a="http://schemas.openxmlformats.org/drawingml/2006/main" noChangeAspect="1"/>
             </wp:cNvGraphicFramePr>
@@ -12640,7 +12672,7 @@
               <a:graphicData uri="http://schemas.openxmlformats.org/drawingml/2006/picture">
                 <pic:pic xmlns:pic="http://schemas.openxmlformats.org/drawingml/2006/picture">
                   <pic:nvPicPr>
-                    <pic:cNvPr id="61" name="Picture 26"/>
+                    <pic:cNvPr id="64" name="Picture 3"/>
                     <pic:cNvPicPr>
                       <a:picLocks noChangeAspect="1"/>
                     </pic:cNvPicPr>
@@ -12654,7 +12686,7 @@
                   <pic:spPr>
                     <a:xfrm>
                       <a:off x="0" y="0"/>
-                      <a:ext cx="6372860" cy="2194560"/>
+                      <a:ext cx="6348095" cy="2560320"/>
                     </a:xfrm>
                     <a:prstGeom prst="rect">
                       <a:avLst/>
@@ -12674,6 +12706,7 @@
     <w:p>
       <w:pPr>
         <w:numPr>
+          <w:ilvl w:val="0"/>
           <w:numId w:val="0"/>
         </w:numPr>
         <w:tabs>
@@ -12682,16 +12715,26 @@
         <w:spacing w:before="120" w:after="120" w:line="360" w:lineRule="auto"/>
         <w:ind w:left="708" w:leftChars="0"/>
         <w:rPr>
-          <w:rFonts w:hint="default"/>
+          <w:rFonts w:hint="default" w:ascii="Times New Roman" w:hAnsi="Times New Roman" w:cs="Times New Roman"/>
+          <w:sz w:val="26"/>
+          <w:szCs w:val="26"/>
           <w:lang w:val="en-US"/>
         </w:rPr>
       </w:pPr>
-      <w:bookmarkStart w:id="0" w:name="_GoBack"/>
-      <w:bookmarkEnd w:id="0"/>
+      <w:r>
+        <w:rPr>
+          <w:rFonts w:hint="default" w:ascii="Times New Roman" w:hAnsi="Times New Roman" w:cs="Times New Roman"/>
+          <w:sz w:val="26"/>
+          <w:szCs w:val="26"/>
+          <w:lang w:val="en-US"/>
+        </w:rPr>
+        <w:t>Trước tiên cần copy file key_pair vào instance EC2 public</w:t>
+      </w:r>
     </w:p>
     <w:p>
       <w:pPr>
         <w:numPr>
+          <w:ilvl w:val="0"/>
           <w:numId w:val="0"/>
         </w:numPr>
         <w:tabs>
@@ -12699,6 +12742,7 @@
         </w:tabs>
         <w:spacing w:before="120" w:after="120" w:line="360" w:lineRule="auto"/>
         <w:ind w:left="708" w:leftChars="0"/>
+        <w:jc w:val="center"/>
         <w:rPr>
           <w:rFonts w:hint="default" w:ascii="Times New Roman" w:hAnsi="Times New Roman" w:cs="Times New Roman"/>
           <w:sz w:val="26"/>
@@ -12707,13 +12751,473 @@
         </w:rPr>
       </w:pPr>
       <w:r>
+        <w:drawing>
+          <wp:inline distT="0" distB="0" distL="114300" distR="114300">
+            <wp:extent cx="5455920" cy="457200"/>
+            <wp:effectExtent l="0" t="0" r="0" b="0"/>
+            <wp:docPr id="62" name="Picture 1"/>
+            <wp:cNvGraphicFramePr>
+              <a:graphicFrameLocks xmlns:a="http://schemas.openxmlformats.org/drawingml/2006/main" noChangeAspect="1"/>
+            </wp:cNvGraphicFramePr>
+            <a:graphic xmlns:a="http://schemas.openxmlformats.org/drawingml/2006/main">
+              <a:graphicData uri="http://schemas.openxmlformats.org/drawingml/2006/picture">
+                <pic:pic xmlns:pic="http://schemas.openxmlformats.org/drawingml/2006/picture">
+                  <pic:nvPicPr>
+                    <pic:cNvPr id="62" name="Picture 1"/>
+                    <pic:cNvPicPr>
+                      <a:picLocks noChangeAspect="1"/>
+                    </pic:cNvPicPr>
+                  </pic:nvPicPr>
+                  <pic:blipFill>
+                    <a:blip r:embed="rId42"/>
+                    <a:stretch>
+                      <a:fillRect/>
+                    </a:stretch>
+                  </pic:blipFill>
+                  <pic:spPr>
+                    <a:xfrm>
+                      <a:off x="0" y="0"/>
+                      <a:ext cx="5455920" cy="457200"/>
+                    </a:xfrm>
+                    <a:prstGeom prst="rect">
+                      <a:avLst/>
+                    </a:prstGeom>
+                    <a:noFill/>
+                    <a:ln>
+                      <a:noFill/>
+                    </a:ln>
+                  </pic:spPr>
+                </pic:pic>
+              </a:graphicData>
+            </a:graphic>
+          </wp:inline>
+        </w:drawing>
+      </w:r>
+    </w:p>
+    <w:p>
+      <w:pPr>
+        <w:numPr>
+          <w:ilvl w:val="0"/>
+          <w:numId w:val="0"/>
+        </w:numPr>
+        <w:tabs>
+          <w:tab w:val="left" w:pos="1496"/>
+        </w:tabs>
+        <w:spacing w:before="120" w:after="120" w:line="360" w:lineRule="auto"/>
+        <w:ind w:left="708" w:leftChars="0"/>
         <w:rPr>
           <w:rFonts w:hint="default" w:ascii="Times New Roman" w:hAnsi="Times New Roman" w:cs="Times New Roman"/>
           <w:sz w:val="26"/>
           <w:szCs w:val="26"/>
           <w:lang w:val="en-US"/>
         </w:rPr>
-        <w:t xml:space="preserve">. </w:t>
+      </w:pPr>
+      <w:r>
+        <w:rPr>
+          <w:rFonts w:hint="default" w:ascii="Times New Roman" w:hAnsi="Times New Roman" w:cs="Times New Roman"/>
+          <w:sz w:val="26"/>
+          <w:szCs w:val="26"/>
+          <w:lang w:val="en-US"/>
+        </w:rPr>
+        <w:t>Kiểm tra trên instance</w:t>
+      </w:r>
+    </w:p>
+    <w:p>
+      <w:pPr>
+        <w:numPr>
+          <w:ilvl w:val="0"/>
+          <w:numId w:val="0"/>
+        </w:numPr>
+        <w:tabs>
+          <w:tab w:val="left" w:pos="1496"/>
+        </w:tabs>
+        <w:spacing w:before="120" w:after="120" w:line="360" w:lineRule="auto"/>
+        <w:ind w:left="708" w:leftChars="0"/>
+        <w:jc w:val="center"/>
+        <w:rPr>
+          <w:rFonts w:hint="default" w:ascii="Times New Roman" w:hAnsi="Times New Roman" w:cs="Times New Roman"/>
+          <w:sz w:val="26"/>
+          <w:szCs w:val="26"/>
+          <w:lang w:val="en-US"/>
+        </w:rPr>
+      </w:pPr>
+      <w:r>
+        <w:drawing>
+          <wp:inline distT="0" distB="0" distL="114300" distR="114300">
+            <wp:extent cx="4210050" cy="1085850"/>
+            <wp:effectExtent l="0" t="0" r="11430" b="11430"/>
+            <wp:docPr id="63" name="Picture 2"/>
+            <wp:cNvGraphicFramePr>
+              <a:graphicFrameLocks xmlns:a="http://schemas.openxmlformats.org/drawingml/2006/main" noChangeAspect="1"/>
+            </wp:cNvGraphicFramePr>
+            <a:graphic xmlns:a="http://schemas.openxmlformats.org/drawingml/2006/main">
+              <a:graphicData uri="http://schemas.openxmlformats.org/drawingml/2006/picture">
+                <pic:pic xmlns:pic="http://schemas.openxmlformats.org/drawingml/2006/picture">
+                  <pic:nvPicPr>
+                    <pic:cNvPr id="63" name="Picture 2"/>
+                    <pic:cNvPicPr>
+                      <a:picLocks noChangeAspect="1"/>
+                    </pic:cNvPicPr>
+                  </pic:nvPicPr>
+                  <pic:blipFill>
+                    <a:blip r:embed="rId43"/>
+                    <a:stretch>
+                      <a:fillRect/>
+                    </a:stretch>
+                  </pic:blipFill>
+                  <pic:spPr>
+                    <a:xfrm>
+                      <a:off x="0" y="0"/>
+                      <a:ext cx="4210050" cy="1085850"/>
+                    </a:xfrm>
+                    <a:prstGeom prst="rect">
+                      <a:avLst/>
+                    </a:prstGeom>
+                    <a:noFill/>
+                    <a:ln>
+                      <a:noFill/>
+                    </a:ln>
+                  </pic:spPr>
+                </pic:pic>
+              </a:graphicData>
+            </a:graphic>
+          </wp:inline>
+        </w:drawing>
+      </w:r>
+    </w:p>
+    <w:p>
+      <w:pPr>
+        <w:numPr>
+          <w:ilvl w:val="0"/>
+          <w:numId w:val="0"/>
+        </w:numPr>
+        <w:tabs>
+          <w:tab w:val="left" w:pos="1496"/>
+        </w:tabs>
+        <w:spacing w:before="120" w:after="120" w:line="360" w:lineRule="auto"/>
+        <w:ind w:left="708" w:leftChars="0"/>
+        <w:rPr>
+          <w:rFonts w:hint="default" w:ascii="Times New Roman" w:hAnsi="Times New Roman" w:cs="Times New Roman"/>
+          <w:sz w:val="26"/>
+          <w:szCs w:val="26"/>
+          <w:lang w:val="en-US"/>
+        </w:rPr>
+      </w:pPr>
+      <w:r>
+        <w:rPr>
+          <w:rFonts w:hint="default" w:ascii="Times New Roman" w:hAnsi="Times New Roman" w:cs="Times New Roman"/>
+          <w:sz w:val="26"/>
+          <w:szCs w:val="26"/>
+          <w:lang w:val="en-US"/>
+        </w:rPr>
+        <w:t xml:space="preserve">Tiến hành SSH </w:t>
+      </w:r>
+    </w:p>
+    <w:p>
+      <w:pPr>
+        <w:numPr>
+          <w:ilvl w:val="0"/>
+          <w:numId w:val="0"/>
+        </w:numPr>
+        <w:tabs>
+          <w:tab w:val="left" w:pos="1496"/>
+        </w:tabs>
+        <w:spacing w:before="120" w:after="120" w:line="360" w:lineRule="auto"/>
+        <w:ind w:left="708" w:leftChars="0"/>
+        <w:jc w:val="center"/>
+        <w:rPr>
+          <w:rFonts w:hint="default" w:ascii="Times New Roman" w:hAnsi="Times New Roman" w:cs="Times New Roman"/>
+          <w:sz w:val="26"/>
+          <w:szCs w:val="26"/>
+          <w:lang w:val="en-US"/>
+        </w:rPr>
+      </w:pPr>
+      <w:r>
+        <w:drawing>
+          <wp:inline distT="0" distB="0" distL="114300" distR="114300">
+            <wp:extent cx="6334125" cy="2560320"/>
+            <wp:effectExtent l="0" t="0" r="5715" b="0"/>
+            <wp:docPr id="67" name="Picture 6"/>
+            <wp:cNvGraphicFramePr>
+              <a:graphicFrameLocks xmlns:a="http://schemas.openxmlformats.org/drawingml/2006/main" noChangeAspect="1"/>
+            </wp:cNvGraphicFramePr>
+            <a:graphic xmlns:a="http://schemas.openxmlformats.org/drawingml/2006/main">
+              <a:graphicData uri="http://schemas.openxmlformats.org/drawingml/2006/picture">
+                <pic:pic xmlns:pic="http://schemas.openxmlformats.org/drawingml/2006/picture">
+                  <pic:nvPicPr>
+                    <pic:cNvPr id="67" name="Picture 6"/>
+                    <pic:cNvPicPr>
+                      <a:picLocks noChangeAspect="1"/>
+                    </pic:cNvPicPr>
+                  </pic:nvPicPr>
+                  <pic:blipFill>
+                    <a:blip r:embed="rId44"/>
+                    <a:stretch>
+                      <a:fillRect/>
+                    </a:stretch>
+                  </pic:blipFill>
+                  <pic:spPr>
+                    <a:xfrm>
+                      <a:off x="0" y="0"/>
+                      <a:ext cx="6334125" cy="2560320"/>
+                    </a:xfrm>
+                    <a:prstGeom prst="rect">
+                      <a:avLst/>
+                    </a:prstGeom>
+                    <a:noFill/>
+                    <a:ln>
+                      <a:noFill/>
+                    </a:ln>
+                  </pic:spPr>
+                </pic:pic>
+              </a:graphicData>
+            </a:graphic>
+          </wp:inline>
+        </w:drawing>
+      </w:r>
+    </w:p>
+    <w:p>
+      <w:pPr>
+        <w:numPr>
+          <w:ilvl w:val="0"/>
+          <w:numId w:val="0"/>
+        </w:numPr>
+        <w:tabs>
+          <w:tab w:val="left" w:pos="1496"/>
+        </w:tabs>
+        <w:spacing w:before="120" w:after="120" w:line="360" w:lineRule="auto"/>
+        <w:ind w:left="708" w:leftChars="0"/>
+        <w:rPr>
+          <w:rFonts w:hint="default" w:ascii="Times New Roman" w:hAnsi="Times New Roman" w:cs="Times New Roman"/>
+          <w:sz w:val="26"/>
+          <w:szCs w:val="26"/>
+          <w:lang w:val="en-US"/>
+        </w:rPr>
+      </w:pPr>
+      <w:r>
+        <w:rPr>
+          <w:rFonts w:hint="default" w:ascii="Times New Roman" w:hAnsi="Times New Roman" w:cs="Times New Roman"/>
+          <w:sz w:val="26"/>
+          <w:szCs w:val="26"/>
+          <w:lang w:val="en-US"/>
+        </w:rPr>
+        <w:t>Ping tới 8.8.8.8</w:t>
+      </w:r>
+    </w:p>
+    <w:p>
+      <w:pPr>
+        <w:numPr>
+          <w:ilvl w:val="0"/>
+          <w:numId w:val="0"/>
+        </w:numPr>
+        <w:tabs>
+          <w:tab w:val="left" w:pos="1496"/>
+        </w:tabs>
+        <w:spacing w:before="120" w:after="120" w:line="360" w:lineRule="auto"/>
+        <w:ind w:left="708" w:leftChars="0"/>
+        <w:rPr>
+          <w:rFonts w:hint="default" w:ascii="Times New Roman" w:hAnsi="Times New Roman" w:cs="Times New Roman"/>
+          <w:sz w:val="26"/>
+          <w:szCs w:val="26"/>
+          <w:lang w:val="en-US"/>
+        </w:rPr>
+      </w:pPr>
+      <w:r>
+        <w:drawing>
+          <wp:inline distT="0" distB="0" distL="114300" distR="114300">
+            <wp:extent cx="6362700" cy="1924050"/>
+            <wp:effectExtent l="0" t="0" r="7620" b="11430"/>
+            <wp:docPr id="68" name="Picture 7"/>
+            <wp:cNvGraphicFramePr>
+              <a:graphicFrameLocks xmlns:a="http://schemas.openxmlformats.org/drawingml/2006/main" noChangeAspect="1"/>
+            </wp:cNvGraphicFramePr>
+            <a:graphic xmlns:a="http://schemas.openxmlformats.org/drawingml/2006/main">
+              <a:graphicData uri="http://schemas.openxmlformats.org/drawingml/2006/picture">
+                <pic:pic xmlns:pic="http://schemas.openxmlformats.org/drawingml/2006/picture">
+                  <pic:nvPicPr>
+                    <pic:cNvPr id="68" name="Picture 7"/>
+                    <pic:cNvPicPr>
+                      <a:picLocks noChangeAspect="1"/>
+                    </pic:cNvPicPr>
+                  </pic:nvPicPr>
+                  <pic:blipFill>
+                    <a:blip r:embed="rId45"/>
+                    <a:stretch>
+                      <a:fillRect/>
+                    </a:stretch>
+                  </pic:blipFill>
+                  <pic:spPr>
+                    <a:xfrm>
+                      <a:off x="0" y="0"/>
+                      <a:ext cx="6362700" cy="1924050"/>
+                    </a:xfrm>
+                    <a:prstGeom prst="rect">
+                      <a:avLst/>
+                    </a:prstGeom>
+                    <a:noFill/>
+                    <a:ln>
+                      <a:noFill/>
+                    </a:ln>
+                  </pic:spPr>
+                </pic:pic>
+              </a:graphicData>
+            </a:graphic>
+          </wp:inline>
+        </w:drawing>
+      </w:r>
+      <w:r>
+        <w:rPr>
+          <w:rFonts w:hint="default" w:ascii="Times New Roman" w:hAnsi="Times New Roman" w:cs="Times New Roman"/>
+          <w:sz w:val="26"/>
+          <w:szCs w:val="26"/>
+          <w:lang w:val="en-US"/>
+        </w:rPr>
+        <w:t xml:space="preserve"> </w:t>
+      </w:r>
+    </w:p>
+    <w:p>
+      <w:pPr>
+        <w:numPr>
+          <w:ilvl w:val="0"/>
+          <w:numId w:val="0"/>
+        </w:numPr>
+        <w:tabs>
+          <w:tab w:val="left" w:pos="1496"/>
+        </w:tabs>
+        <w:spacing w:before="120" w:after="120" w:line="360" w:lineRule="auto"/>
+        <w:ind w:left="708" w:leftChars="0"/>
+        <w:jc w:val="both"/>
+        <w:rPr>
+          <w:rFonts w:hint="default" w:ascii="Times New Roman" w:hAnsi="Times New Roman" w:cs="Times New Roman"/>
+          <w:sz w:val="26"/>
+          <w:szCs w:val="26"/>
+          <w:lang w:val="en-US"/>
+        </w:rPr>
+      </w:pPr>
+      <w:r>
+        <w:rPr>
+          <w:rFonts w:hint="default" w:ascii="Times New Roman" w:hAnsi="Times New Roman" w:cs="Times New Roman"/>
+          <w:sz w:val="26"/>
+          <w:szCs w:val="26"/>
+          <w:lang w:val="en-US"/>
+        </w:rPr>
+        <w:t>Bây giờ thử ssh vào public từ một máy khác với ip khác và ssh vào private bằng máy khác không nằm trong security group public (bằng cách kết nối wifi khác sẽ có ip public khác)</w:t>
+      </w:r>
+    </w:p>
+    <w:p>
+      <w:pPr>
+        <w:numPr>
+          <w:ilvl w:val="0"/>
+          <w:numId w:val="0"/>
+        </w:numPr>
+        <w:tabs>
+          <w:tab w:val="left" w:pos="1496"/>
+        </w:tabs>
+        <w:spacing w:before="120" w:after="120" w:line="360" w:lineRule="auto"/>
+        <w:ind w:left="708" w:leftChars="0"/>
+      </w:pPr>
+      <w:r>
+        <w:drawing>
+          <wp:inline distT="0" distB="0" distL="114300" distR="114300">
+            <wp:extent cx="6463030" cy="3108960"/>
+            <wp:effectExtent l="0" t="0" r="13970" b="0"/>
+            <wp:docPr id="70" name="Picture 9"/>
+            <wp:cNvGraphicFramePr>
+              <a:graphicFrameLocks xmlns:a="http://schemas.openxmlformats.org/drawingml/2006/main" noChangeAspect="1"/>
+            </wp:cNvGraphicFramePr>
+            <a:graphic xmlns:a="http://schemas.openxmlformats.org/drawingml/2006/main">
+              <a:graphicData uri="http://schemas.openxmlformats.org/drawingml/2006/picture">
+                <pic:pic xmlns:pic="http://schemas.openxmlformats.org/drawingml/2006/picture">
+                  <pic:nvPicPr>
+                    <pic:cNvPr id="70" name="Picture 9"/>
+                    <pic:cNvPicPr>
+                      <a:picLocks noChangeAspect="1"/>
+                    </pic:cNvPicPr>
+                  </pic:nvPicPr>
+                  <pic:blipFill>
+                    <a:blip r:embed="rId46"/>
+                    <a:stretch>
+                      <a:fillRect/>
+                    </a:stretch>
+                  </pic:blipFill>
+                  <pic:spPr>
+                    <a:xfrm>
+                      <a:off x="0" y="0"/>
+                      <a:ext cx="6463030" cy="3108960"/>
+                    </a:xfrm>
+                    <a:prstGeom prst="rect">
+                      <a:avLst/>
+                    </a:prstGeom>
+                    <a:noFill/>
+                    <a:ln>
+                      <a:noFill/>
+                    </a:ln>
+                  </pic:spPr>
+                </pic:pic>
+              </a:graphicData>
+            </a:graphic>
+          </wp:inline>
+        </w:drawing>
+      </w:r>
+    </w:p>
+    <w:p>
+      <w:pPr>
+        <w:numPr>
+          <w:ilvl w:val="0"/>
+          <w:numId w:val="0"/>
+        </w:numPr>
+        <w:tabs>
+          <w:tab w:val="left" w:pos="1496"/>
+        </w:tabs>
+        <w:spacing w:before="120" w:after="120" w:line="360" w:lineRule="auto"/>
+        <w:ind w:left="708" w:leftChars="0"/>
+        <w:rPr>
+          <w:rFonts w:hint="default"/>
+          <w:lang w:val="en-US"/>
+        </w:rPr>
+      </w:pPr>
+      <w:r>
+        <w:drawing>
+          <wp:inline distT="0" distB="0" distL="114300" distR="114300">
+            <wp:extent cx="6526530" cy="731520"/>
+            <wp:effectExtent l="0" t="0" r="11430" b="0"/>
+            <wp:docPr id="71" name="Picture 10"/>
+            <wp:cNvGraphicFramePr>
+              <a:graphicFrameLocks xmlns:a="http://schemas.openxmlformats.org/drawingml/2006/main" noChangeAspect="1"/>
+            </wp:cNvGraphicFramePr>
+            <a:graphic xmlns:a="http://schemas.openxmlformats.org/drawingml/2006/main">
+              <a:graphicData uri="http://schemas.openxmlformats.org/drawingml/2006/picture">
+                <pic:pic xmlns:pic="http://schemas.openxmlformats.org/drawingml/2006/picture">
+                  <pic:nvPicPr>
+                    <pic:cNvPr id="71" name="Picture 10"/>
+                    <pic:cNvPicPr>
+                      <a:picLocks noChangeAspect="1"/>
+                    </pic:cNvPicPr>
+                  </pic:nvPicPr>
+                  <pic:blipFill>
+                    <a:blip r:embed="rId47"/>
+                    <a:stretch>
+                      <a:fillRect/>
+                    </a:stretch>
+                  </pic:blipFill>
+                  <pic:spPr>
+                    <a:xfrm>
+                      <a:off x="0" y="0"/>
+                      <a:ext cx="6526530" cy="731520"/>
+                    </a:xfrm>
+                    <a:prstGeom prst="rect">
+                      <a:avLst/>
+                    </a:prstGeom>
+                    <a:noFill/>
+                    <a:ln>
+                      <a:noFill/>
+                    </a:ln>
+                  </pic:spPr>
+                </pic:pic>
+              </a:graphicData>
+            </a:graphic>
+          </wp:inline>
+        </w:drawing>
       </w:r>
     </w:p>
     <w:p>
@@ -12733,6 +13237,49 @@
         </w:rPr>
         <w:t>DÙNG CLOUDFORMATION ĐỂ TRIỂN KHAI</w:t>
       </w:r>
+    </w:p>
+    <w:p>
+      <w:pPr>
+        <w:keepNext w:val="0"/>
+        <w:keepLines w:val="0"/>
+        <w:pageBreakBefore w:val="0"/>
+        <w:widowControl w:val="0"/>
+        <w:kinsoku/>
+        <w:wordWrap/>
+        <w:overflowPunct/>
+        <w:topLinePunct w:val="0"/>
+        <w:autoSpaceDE w:val="0"/>
+        <w:autoSpaceDN w:val="0"/>
+        <w:bidi w:val="0"/>
+        <w:adjustRightInd/>
+        <w:snapToGrid/>
+        <w:spacing w:before="0" w:beforeLines="50" w:after="0" w:afterLines="50" w:line="360" w:lineRule="auto"/>
+        <w:textAlignment w:val="auto"/>
+        <w:rPr>
+          <w:rFonts w:hint="default" w:ascii="Times New Roman" w:hAnsi="Times New Roman" w:cs="Times New Roman"/>
+          <w:sz w:val="26"/>
+          <w:szCs w:val="26"/>
+          <w:lang w:val="en-US"/>
+        </w:rPr>
+      </w:pPr>
+      <w:r>
+        <w:rPr>
+          <w:rFonts w:hint="default"/>
+          <w:lang w:val="en-US"/>
+        </w:rPr>
+        <w:tab/>
+      </w:r>
+      <w:r>
+        <w:rPr>
+          <w:rFonts w:hint="default" w:ascii="Times New Roman" w:hAnsi="Times New Roman" w:cs="Times New Roman"/>
+          <w:sz w:val="26"/>
+          <w:szCs w:val="26"/>
+          <w:lang w:val="en-US"/>
+        </w:rPr>
+        <w:t>(viết tại đây)</w:t>
+      </w:r>
+      <w:bookmarkStart w:id="0" w:name="_GoBack"/>
+      <w:bookmarkEnd w:id="0"/>
     </w:p>
     <w:sectPr>
       <w:pgSz w:w="11910" w:h="16840"/>
@@ -14824,6 +15371,21 @@
 </file>
 
 <file path=customXml/item2.xml><?xml version="1.0" encoding="utf-8"?>
+<p:properties xmlns:p="http://schemas.microsoft.com/office/2006/metadata/properties" xmlns:xsi="http://www.w3.org/2001/XMLSchema-instance" xmlns:pc="http://schemas.microsoft.com/office/infopath/2007/PartnerControls">
+  <documentManagement/>
+</p:properties>
+</file>
+
+<file path=customXml/item3.xml><?xml version="1.0" encoding="utf-8"?>
+<?mso-contentType ?>
+<FormTemplates xmlns="http://schemas.microsoft.com/sharepoint/v3/contenttype/forms">
+  <Display>DocumentLibraryForm</Display>
+  <Edit>DocumentLibraryForm</Edit>
+  <New>DocumentLibraryForm</New>
+</FormTemplates>
+</file>
+
+<file path=customXml/item4.xml><?xml version="1.0" encoding="utf-8"?>
 <ct:contentTypeSchema xmlns:ct="http://schemas.microsoft.com/office/2006/metadata/contentType" xmlns:ma="http://schemas.microsoft.com/office/2006/metadata/properties/metaAttributes" ct:_="" ma:_="" ma:contentTypeName="Tài liệu" ma:contentTypeID="0x010100222964FF3F004940A586354C555C95DA" ma:contentTypeVersion="7" ma:contentTypeDescription="Tạo tài liệu mới." ma:contentTypeScope="" ma:versionID="23f4f94e06020b25565233aaf2952740">
   <xsd:schema xmlns:xsd="http://www.w3.org/2001/XMLSchema" xmlns:xs="http://www.w3.org/2001/XMLSchema" xmlns:p="http://schemas.microsoft.com/office/2006/metadata/properties" xmlns:ns2="f7c84132-0c58-4b65-8914-57d2d0330416" targetNamespace="http://schemas.microsoft.com/office/2006/metadata/properties" ma:root="true" ma:fieldsID="772591d1812669b99b4658a3d32aaf36" ns2:_="">
     <xsd:import namespace="f7c84132-0c58-4b65-8914-57d2d0330416"/>
@@ -14985,21 +15547,6 @@
 </ct:contentTypeSchema>
 </file>
 
-<file path=customXml/item3.xml><?xml version="1.0" encoding="utf-8"?>
-<?mso-contentType ?>
-<FormTemplates xmlns="http://schemas.microsoft.com/sharepoint/v3/contenttype/forms">
-  <Display>DocumentLibraryForm</Display>
-  <Edit>DocumentLibraryForm</Edit>
-  <New>DocumentLibraryForm</New>
-</FormTemplates>
-</file>
-
-<file path=customXml/item4.xml><?xml version="1.0" encoding="utf-8"?>
-<p:properties xmlns:p="http://schemas.microsoft.com/office/2006/metadata/properties" xmlns:xsi="http://www.w3.org/2001/XMLSchema-instance" xmlns:pc="http://schemas.microsoft.com/office/infopath/2007/PartnerControls">
-  <documentManagement/>
-</p:properties>
-</file>
-
 <file path=customXml/itemProps1.xml><?xml version="1.0" encoding="utf-8"?>
 <ds:datastoreItem xmlns:ds="http://schemas.openxmlformats.org/officeDocument/2006/customXml" ds:itemID="{B1977F7D-205B-4081-913C-38D41E755F92}">
   <ds:schemaRefs>
@@ -15009,7 +15556,7 @@
 </file>
 
 <file path=customXml/itemProps2.xml><?xml version="1.0" encoding="utf-8"?>
-<ds:datastoreItem xmlns:ds="http://schemas.openxmlformats.org/officeDocument/2006/customXml" ds:itemID="{E4E65064-2BAF-4758-867C-A773231B9532}">
+<ds:datastoreItem xmlns:ds="http://schemas.openxmlformats.org/officeDocument/2006/customXml" ds:itemID="{C09AD311-E8F6-42FA-A294-8B23D8F3902E}">
   <ds:schemaRefs/>
 </ds:datastoreItem>
 </file>
@@ -15021,7 +15568,7 @@
 </file>
 
 <file path=customXml/itemProps4.xml><?xml version="1.0" encoding="utf-8"?>
-<ds:datastoreItem xmlns:ds="http://schemas.openxmlformats.org/officeDocument/2006/customXml" ds:itemID="{C09AD311-E8F6-42FA-A294-8B23D8F3902E}">
+<ds:datastoreItem xmlns:ds="http://schemas.openxmlformats.org/officeDocument/2006/customXml" ds:itemID="{E4E65064-2BAF-4758-867C-A773231B9532}">
   <ds:schemaRefs/>
 </ds:datastoreItem>
 </file>
</xml_diff>